<commit_message>
Naik taraf sistem: Integrasi penuh portal mylink.la/skranggutawau, data autentik kelas Mumtaz/Jayyid/Iltizam/Khoir, PBD TP1-TP6 & direktori Drive
</commit_message>
<xml_diff>
--- a/Template_Slip_Keputusan_SK_Ranggu.docx
+++ b/Template_Slip_Keputusan_SK_Ranggu.docx
@@ -10,9 +10,9 @@
         <w:tblLook w:firstColumn="1" w:firstRow="1" w:lastColumn="0" w:lastRow="0" w:noHBand="0" w:noVBand="1" w:val="04A0"/>
       </w:tblPr>
       <w:tblGrid>
-        <w:gridCol w:w="3504"/>
-        <w:gridCol w:w="3504"/>
-        <w:gridCol w:w="3504"/>
+        <w:gridCol w:w="3600"/>
+        <w:gridCol w:w="3600"/>
+        <w:gridCol w:w="3600"/>
       </w:tblGrid>
       <w:tr>
         <w:tc>
@@ -61,7 +61,7 @@
         </w:tc>
         <w:tc>
           <w:tcPr>
-            <w:tcW w:type="dxa" w:w="6912"/>
+            <w:tcW w:type="dxa" w:w="7200"/>
           </w:tcPr>
           <w:p>
             <w:pPr>
@@ -71,7 +71,7 @@
               <w:rPr>
                 <w:b/>
                 <w:color w:val="0F172A"/>
-                <w:sz w:val="22"/>
+                <w:sz w:val="21"/>
               </w:rPr>
               <w:t>KEMENTERIAN PENDIDIKAN MALAYSIA</w:t>
               <w:br/>
@@ -91,6 +91,8 @@
                 <w:sz w:val="17"/>
               </w:rPr>
               <w:t>PETI SURAT 61576, 91124 TAWAU, SABAH • KOD SEKOLAH: XBA3037</w:t>
+              <w:br/>
+              <w:t>Portal Rasmi PBD: https://mylink.la/skranggutawau</w:t>
             </w:r>
           </w:p>
         </w:tc>
@@ -142,7 +144,7 @@
     </w:tbl>
     <w:p>
       <w:pPr>
-        <w:spacing w:before="80" w:after="80"/>
+        <w:spacing w:after="40"/>
       </w:pPr>
     </w:p>
     <w:tbl>
@@ -152,12 +154,12 @@
         <w:tblLook w:firstColumn="1" w:firstRow="1" w:lastColumn="0" w:lastRow="0" w:noHBand="0" w:noVBand="1" w:val="04A0"/>
       </w:tblPr>
       <w:tblGrid>
-        <w:gridCol w:w="10512"/>
+        <w:gridCol w:w="10800"/>
       </w:tblGrid>
       <w:tr>
         <w:tc>
           <w:tcPr>
-            <w:tcW w:type="dxa" w:w="10368"/>
+            <w:tcW w:type="dxa" w:w="10656"/>
             <w:shd w:val="clear" w:color="auto" w:fill="F1F5F9"/>
             <w:tcBorders>
               <w:top w:val="single" w:sz="4" w:space="0" w:color="CBD5E1"/>
@@ -176,15 +178,15 @@
                 <w:color w:val="0F172A"/>
                 <w:sz w:val="22"/>
               </w:rPr>
-              <w:t>SLIP KEPUTUSAN PENTAKSIRAN AKHIR SESI AKADEMIK (PASA)</w:t>
+              <w:t>PELAPORAN PENTAKSIRAN BILIK DARJAH (PBD) &amp; UASA 2026</w:t>
               <w:br/>
             </w:r>
             <w:r>
               <w:rPr>
                 <w:color w:val="475569"/>
-                <w:sz w:val="19"/>
+                <w:sz w:val="18"/>
               </w:rPr>
-              <w:t>SESI AKADEMIK: &lt;&lt;SESI&gt;&gt;</w:t>
+              <w:t>SESI PENTAKSIRAN: &lt;&lt;SESI&gt;&gt;</w:t>
             </w:r>
           </w:p>
         </w:tc>
@@ -202,15 +204,15 @@
         <w:tblLook w:firstColumn="1" w:firstRow="1" w:lastColumn="0" w:lastRow="0" w:noHBand="0" w:noVBand="1" w:val="04A0"/>
       </w:tblPr>
       <w:tblGrid>
-        <w:gridCol w:w="2628"/>
-        <w:gridCol w:w="2628"/>
-        <w:gridCol w:w="2628"/>
-        <w:gridCol w:w="2628"/>
+        <w:gridCol w:w="2700"/>
+        <w:gridCol w:w="2700"/>
+        <w:gridCol w:w="2700"/>
+        <w:gridCol w:w="2700"/>
       </w:tblGrid>
       <w:tr>
         <w:tc>
           <w:tcPr>
-            <w:tcW w:type="dxa" w:w="2160"/>
+            <w:tcW w:type="dxa" w:w="2304"/>
             <w:tcBorders>
               <w:top w:val="single" w:sz="4" w:space="0" w:color="E2E8F0"/>
               <w:bottom w:val="single" w:sz="4" w:space="0" w:color="E2E8F0"/>
@@ -230,7 +232,7 @@
         </w:tc>
         <w:tc>
           <w:tcPr>
-            <w:tcW w:type="dxa" w:w="3312"/>
+            <w:tcW w:type="dxa" w:w="3456"/>
             <w:tcBorders>
               <w:top w:val="single" w:sz="4" w:space="0" w:color="E2E8F0"/>
               <w:bottom w:val="single" w:sz="4" w:space="0" w:color="E2E8F0"/>
@@ -284,7 +286,7 @@
       <w:tr>
         <w:tc>
           <w:tcPr>
-            <w:tcW w:type="dxa" w:w="2160"/>
+            <w:tcW w:type="dxa" w:w="2304"/>
             <w:tcBorders>
               <w:top w:val="single" w:sz="4" w:space="0" w:color="E2E8F0"/>
               <w:bottom w:val="single" w:sz="4" w:space="0" w:color="E2E8F0"/>
@@ -304,7 +306,7 @@
         </w:tc>
         <w:tc>
           <w:tcPr>
-            <w:tcW w:type="dxa" w:w="3312"/>
+            <w:tcW w:type="dxa" w:w="3456"/>
             <w:tcBorders>
               <w:top w:val="single" w:sz="4" w:space="0" w:color="E2E8F0"/>
               <w:bottom w:val="single" w:sz="4" w:space="0" w:color="E2E8F0"/>
@@ -334,7 +336,7 @@
               <w:rPr>
                 <w:b/>
               </w:rPr>
-              <w:t>KEHADIRAN</w:t>
+              <w:t>GURU KELAS</w:t>
             </w:r>
           </w:p>
         </w:tc>
@@ -350,7 +352,7 @@
           </w:tcPr>
           <w:p>
             <w:r>
-              <w:t>&lt;&lt;HADIR&gt;&gt;</w:t>
+              <w:t>&lt;&lt;GURU_KELAS&gt;&gt;</w:t>
             </w:r>
           </w:p>
         </w:tc>
@@ -368,15 +370,16 @@
         <w:tblLook w:firstColumn="1" w:firstRow="1" w:lastColumn="0" w:lastRow="0" w:noHBand="0" w:noVBand="1" w:val="04A0"/>
       </w:tblPr>
       <w:tblGrid>
-        <w:gridCol w:w="2628"/>
-        <w:gridCol w:w="2628"/>
-        <w:gridCol w:w="2628"/>
-        <w:gridCol w:w="2628"/>
+        <w:gridCol w:w="2160"/>
+        <w:gridCol w:w="2160"/>
+        <w:gridCol w:w="2160"/>
+        <w:gridCol w:w="2160"/>
+        <w:gridCol w:w="2160"/>
       </w:tblGrid>
       <w:tr>
         <w:tc>
           <w:tcPr>
-            <w:tcW w:type="dxa" w:w="864"/>
+            <w:tcW w:type="dxa" w:w="720"/>
             <w:shd w:val="clear" w:color="auto" w:fill="0F172A"/>
           </w:tcPr>
           <w:p>
@@ -387,7 +390,7 @@
               <w:rPr>
                 <w:b/>
                 <w:color w:val="FFFFFF"/>
-                <w:sz w:val="19"/>
+                <w:sz w:val="18"/>
               </w:rPr>
               <w:t>BIL</w:t>
             </w:r>
@@ -395,7 +398,7 @@
         </w:tc>
         <w:tc>
           <w:tcPr>
-            <w:tcW w:type="dxa" w:w="6048"/>
+            <w:tcW w:type="dxa" w:w="4896"/>
             <w:shd w:val="clear" w:color="auto" w:fill="0F172A"/>
           </w:tcPr>
           <w:p>
@@ -406,7 +409,7 @@
               <w:rPr>
                 <w:b/>
                 <w:color w:val="FFFFFF"/>
-                <w:sz w:val="19"/>
+                <w:sz w:val="18"/>
               </w:rPr>
               <w:t>MATA PELAJARAN</w:t>
             </w:r>
@@ -414,7 +417,7 @@
         </w:tc>
         <w:tc>
           <w:tcPr>
-            <w:tcW w:type="dxa" w:w="1728"/>
+            <w:tcW w:type="dxa" w:w="1440"/>
             <w:shd w:val="clear" w:color="auto" w:fill="0F172A"/>
           </w:tcPr>
           <w:p>
@@ -425,7 +428,7 @@
               <w:rPr>
                 <w:b/>
                 <w:color w:val="FFFFFF"/>
-                <w:sz w:val="19"/>
+                <w:sz w:val="18"/>
               </w:rPr>
               <w:t>MARKAH</w:t>
             </w:r>
@@ -433,7 +436,7 @@
         </w:tc>
         <w:tc>
           <w:tcPr>
-            <w:tcW w:type="dxa" w:w="1728"/>
+            <w:tcW w:type="dxa" w:w="1296"/>
             <w:shd w:val="clear" w:color="auto" w:fill="0F172A"/>
           </w:tcPr>
           <w:p>
@@ -444,9 +447,28 @@
               <w:rPr>
                 <w:b/>
                 <w:color w:val="FFFFFF"/>
-                <w:sz w:val="19"/>
+                <w:sz w:val="18"/>
               </w:rPr>
               <w:t>GRED</w:t>
+            </w:r>
+          </w:p>
+        </w:tc>
+        <w:tc>
+          <w:tcPr>
+            <w:tcW w:type="dxa" w:w="2304"/>
+            <w:shd w:val="clear" w:color="auto" w:fill="0F172A"/>
+          </w:tcPr>
+          <w:p>
+            <w:pPr>
+              <w:jc w:val="center"/>
+            </w:pPr>
+            <w:r>
+              <w:rPr>
+                <w:b/>
+                <w:color w:val="FFFFFF"/>
+                <w:sz w:val="18"/>
+              </w:rPr>
+              <w:t>TAHAP PENGUASAAN</w:t>
             </w:r>
           </w:p>
         </w:tc>
@@ -454,7 +476,7 @@
       <w:tr>
         <w:tc>
           <w:tcPr>
-            <w:tcW w:type="dxa" w:w="2628"/>
+            <w:tcW w:type="dxa" w:w="2160"/>
             <w:tcBorders>
               <w:top w:val="single" w:sz="4" w:space="0" w:color="334155"/>
               <w:bottom w:val="single" w:sz="4" w:space="0" w:color="334155"/>
@@ -473,7 +495,7 @@
         </w:tc>
         <w:tc>
           <w:tcPr>
-            <w:tcW w:type="dxa" w:w="2628"/>
+            <w:tcW w:type="dxa" w:w="2160"/>
             <w:tcBorders>
               <w:top w:val="single" w:sz="4" w:space="0" w:color="334155"/>
               <w:bottom w:val="single" w:sz="4" w:space="0" w:color="334155"/>
@@ -492,7 +514,7 @@
         </w:tc>
         <w:tc>
           <w:tcPr>
-            <w:tcW w:type="dxa" w:w="2628"/>
+            <w:tcW w:type="dxa" w:w="2160"/>
             <w:tcBorders>
               <w:top w:val="single" w:sz="4" w:space="0" w:color="334155"/>
               <w:bottom w:val="single" w:sz="4" w:space="0" w:color="334155"/>
@@ -511,7 +533,7 @@
         </w:tc>
         <w:tc>
           <w:tcPr>
-            <w:tcW w:type="dxa" w:w="2628"/>
+            <w:tcW w:type="dxa" w:w="2160"/>
             <w:tcBorders>
               <w:top w:val="single" w:sz="4" w:space="0" w:color="334155"/>
               <w:bottom w:val="single" w:sz="4" w:space="0" w:color="334155"/>
@@ -531,11 +553,30 @@
             </w:r>
           </w:p>
         </w:tc>
+        <w:tc>
+          <w:tcPr>
+            <w:tcW w:type="dxa" w:w="2160"/>
+            <w:tcBorders>
+              <w:top w:val="single" w:sz="4" w:space="0" w:color="334155"/>
+              <w:bottom w:val="single" w:sz="4" w:space="0" w:color="334155"/>
+              <w:left w:val="single" w:sz="4" w:space="0" w:color="334155"/>
+              <w:right w:val="single" w:sz="4" w:space="0" w:color="334155"/>
+            </w:tcBorders>
+          </w:tcPr>
+          <w:p>
+            <w:pPr>
+              <w:jc w:val="center"/>
+            </w:pPr>
+            <w:r>
+              <w:t>&lt;&lt;BM_TP&gt;&gt;</w:t>
+            </w:r>
+          </w:p>
+        </w:tc>
       </w:tr>
       <w:tr>
         <w:tc>
           <w:tcPr>
-            <w:tcW w:type="dxa" w:w="2628"/>
+            <w:tcW w:type="dxa" w:w="2160"/>
             <w:tcBorders>
               <w:top w:val="single" w:sz="4" w:space="0" w:color="334155"/>
               <w:bottom w:val="single" w:sz="4" w:space="0" w:color="334155"/>
@@ -554,7 +595,7 @@
         </w:tc>
         <w:tc>
           <w:tcPr>
-            <w:tcW w:type="dxa" w:w="2628"/>
+            <w:tcW w:type="dxa" w:w="2160"/>
             <w:tcBorders>
               <w:top w:val="single" w:sz="4" w:space="0" w:color="334155"/>
               <w:bottom w:val="single" w:sz="4" w:space="0" w:color="334155"/>
@@ -573,7 +614,7 @@
         </w:tc>
         <w:tc>
           <w:tcPr>
-            <w:tcW w:type="dxa" w:w="2628"/>
+            <w:tcW w:type="dxa" w:w="2160"/>
             <w:tcBorders>
               <w:top w:val="single" w:sz="4" w:space="0" w:color="334155"/>
               <w:bottom w:val="single" w:sz="4" w:space="0" w:color="334155"/>
@@ -592,7 +633,7 @@
         </w:tc>
         <w:tc>
           <w:tcPr>
-            <w:tcW w:type="dxa" w:w="2628"/>
+            <w:tcW w:type="dxa" w:w="2160"/>
             <w:tcBorders>
               <w:top w:val="single" w:sz="4" w:space="0" w:color="334155"/>
               <w:bottom w:val="single" w:sz="4" w:space="0" w:color="334155"/>
@@ -612,11 +653,30 @@
             </w:r>
           </w:p>
         </w:tc>
+        <w:tc>
+          <w:tcPr>
+            <w:tcW w:type="dxa" w:w="2160"/>
+            <w:tcBorders>
+              <w:top w:val="single" w:sz="4" w:space="0" w:color="334155"/>
+              <w:bottom w:val="single" w:sz="4" w:space="0" w:color="334155"/>
+              <w:left w:val="single" w:sz="4" w:space="0" w:color="334155"/>
+              <w:right w:val="single" w:sz="4" w:space="0" w:color="334155"/>
+            </w:tcBorders>
+          </w:tcPr>
+          <w:p>
+            <w:pPr>
+              <w:jc w:val="center"/>
+            </w:pPr>
+            <w:r>
+              <w:t>&lt;&lt;BI_TP&gt;&gt;</w:t>
+            </w:r>
+          </w:p>
+        </w:tc>
       </w:tr>
       <w:tr>
         <w:tc>
           <w:tcPr>
-            <w:tcW w:type="dxa" w:w="2628"/>
+            <w:tcW w:type="dxa" w:w="2160"/>
             <w:tcBorders>
               <w:top w:val="single" w:sz="4" w:space="0" w:color="334155"/>
               <w:bottom w:val="single" w:sz="4" w:space="0" w:color="334155"/>
@@ -635,7 +695,7 @@
         </w:tc>
         <w:tc>
           <w:tcPr>
-            <w:tcW w:type="dxa" w:w="2628"/>
+            <w:tcW w:type="dxa" w:w="2160"/>
             <w:tcBorders>
               <w:top w:val="single" w:sz="4" w:space="0" w:color="334155"/>
               <w:bottom w:val="single" w:sz="4" w:space="0" w:color="334155"/>
@@ -654,7 +714,7 @@
         </w:tc>
         <w:tc>
           <w:tcPr>
-            <w:tcW w:type="dxa" w:w="2628"/>
+            <w:tcW w:type="dxa" w:w="2160"/>
             <w:tcBorders>
               <w:top w:val="single" w:sz="4" w:space="0" w:color="334155"/>
               <w:bottom w:val="single" w:sz="4" w:space="0" w:color="334155"/>
@@ -673,7 +733,7 @@
         </w:tc>
         <w:tc>
           <w:tcPr>
-            <w:tcW w:type="dxa" w:w="2628"/>
+            <w:tcW w:type="dxa" w:w="2160"/>
             <w:tcBorders>
               <w:top w:val="single" w:sz="4" w:space="0" w:color="334155"/>
               <w:bottom w:val="single" w:sz="4" w:space="0" w:color="334155"/>
@@ -693,11 +753,30 @@
             </w:r>
           </w:p>
         </w:tc>
+        <w:tc>
+          <w:tcPr>
+            <w:tcW w:type="dxa" w:w="2160"/>
+            <w:tcBorders>
+              <w:top w:val="single" w:sz="4" w:space="0" w:color="334155"/>
+              <w:bottom w:val="single" w:sz="4" w:space="0" w:color="334155"/>
+              <w:left w:val="single" w:sz="4" w:space="0" w:color="334155"/>
+              <w:right w:val="single" w:sz="4" w:space="0" w:color="334155"/>
+            </w:tcBorders>
+          </w:tcPr>
+          <w:p>
+            <w:pPr>
+              <w:jc w:val="center"/>
+            </w:pPr>
+            <w:r>
+              <w:t>&lt;&lt;MT_TP&gt;&gt;</w:t>
+            </w:r>
+          </w:p>
+        </w:tc>
       </w:tr>
       <w:tr>
         <w:tc>
           <w:tcPr>
-            <w:tcW w:type="dxa" w:w="2628"/>
+            <w:tcW w:type="dxa" w:w="2160"/>
             <w:tcBorders>
               <w:top w:val="single" w:sz="4" w:space="0" w:color="334155"/>
               <w:bottom w:val="single" w:sz="4" w:space="0" w:color="334155"/>
@@ -716,7 +795,7 @@
         </w:tc>
         <w:tc>
           <w:tcPr>
-            <w:tcW w:type="dxa" w:w="2628"/>
+            <w:tcW w:type="dxa" w:w="2160"/>
             <w:tcBorders>
               <w:top w:val="single" w:sz="4" w:space="0" w:color="334155"/>
               <w:bottom w:val="single" w:sz="4" w:space="0" w:color="334155"/>
@@ -735,7 +814,7 @@
         </w:tc>
         <w:tc>
           <w:tcPr>
-            <w:tcW w:type="dxa" w:w="2628"/>
+            <w:tcW w:type="dxa" w:w="2160"/>
             <w:tcBorders>
               <w:top w:val="single" w:sz="4" w:space="0" w:color="334155"/>
               <w:bottom w:val="single" w:sz="4" w:space="0" w:color="334155"/>
@@ -754,7 +833,7 @@
         </w:tc>
         <w:tc>
           <w:tcPr>
-            <w:tcW w:type="dxa" w:w="2628"/>
+            <w:tcW w:type="dxa" w:w="2160"/>
             <w:tcBorders>
               <w:top w:val="single" w:sz="4" w:space="0" w:color="334155"/>
               <w:bottom w:val="single" w:sz="4" w:space="0" w:color="334155"/>
@@ -774,11 +853,30 @@
             </w:r>
           </w:p>
         </w:tc>
+        <w:tc>
+          <w:tcPr>
+            <w:tcW w:type="dxa" w:w="2160"/>
+            <w:tcBorders>
+              <w:top w:val="single" w:sz="4" w:space="0" w:color="334155"/>
+              <w:bottom w:val="single" w:sz="4" w:space="0" w:color="334155"/>
+              <w:left w:val="single" w:sz="4" w:space="0" w:color="334155"/>
+              <w:right w:val="single" w:sz="4" w:space="0" w:color="334155"/>
+            </w:tcBorders>
+          </w:tcPr>
+          <w:p>
+            <w:pPr>
+              <w:jc w:val="center"/>
+            </w:pPr>
+            <w:r>
+              <w:t>&lt;&lt;SN_TP&gt;&gt;</w:t>
+            </w:r>
+          </w:p>
+        </w:tc>
       </w:tr>
       <w:tr>
         <w:tc>
           <w:tcPr>
-            <w:tcW w:type="dxa" w:w="2628"/>
+            <w:tcW w:type="dxa" w:w="2160"/>
             <w:tcBorders>
               <w:top w:val="single" w:sz="4" w:space="0" w:color="334155"/>
               <w:bottom w:val="single" w:sz="4" w:space="0" w:color="334155"/>
@@ -797,7 +895,7 @@
         </w:tc>
         <w:tc>
           <w:tcPr>
-            <w:tcW w:type="dxa" w:w="2628"/>
+            <w:tcW w:type="dxa" w:w="2160"/>
             <w:tcBorders>
               <w:top w:val="single" w:sz="4" w:space="0" w:color="334155"/>
               <w:bottom w:val="single" w:sz="4" w:space="0" w:color="334155"/>
@@ -816,7 +914,7 @@
         </w:tc>
         <w:tc>
           <w:tcPr>
-            <w:tcW w:type="dxa" w:w="2628"/>
+            <w:tcW w:type="dxa" w:w="2160"/>
             <w:tcBorders>
               <w:top w:val="single" w:sz="4" w:space="0" w:color="334155"/>
               <w:bottom w:val="single" w:sz="4" w:space="0" w:color="334155"/>
@@ -835,7 +933,7 @@
         </w:tc>
         <w:tc>
           <w:tcPr>
-            <w:tcW w:type="dxa" w:w="2628"/>
+            <w:tcW w:type="dxa" w:w="2160"/>
             <w:tcBorders>
               <w:top w:val="single" w:sz="4" w:space="0" w:color="334155"/>
               <w:bottom w:val="single" w:sz="4" w:space="0" w:color="334155"/>
@@ -855,11 +953,30 @@
             </w:r>
           </w:p>
         </w:tc>
+        <w:tc>
+          <w:tcPr>
+            <w:tcW w:type="dxa" w:w="2160"/>
+            <w:tcBorders>
+              <w:top w:val="single" w:sz="4" w:space="0" w:color="334155"/>
+              <w:bottom w:val="single" w:sz="4" w:space="0" w:color="334155"/>
+              <w:left w:val="single" w:sz="4" w:space="0" w:color="334155"/>
+              <w:right w:val="single" w:sz="4" w:space="0" w:color="334155"/>
+            </w:tcBorders>
+          </w:tcPr>
+          <w:p>
+            <w:pPr>
+              <w:jc w:val="center"/>
+            </w:pPr>
+            <w:r>
+              <w:t>&lt;&lt;SEJ_TP&gt;&gt;</w:t>
+            </w:r>
+          </w:p>
+        </w:tc>
       </w:tr>
       <w:tr>
         <w:tc>
           <w:tcPr>
-            <w:tcW w:type="dxa" w:w="2628"/>
+            <w:tcW w:type="dxa" w:w="2160"/>
             <w:tcBorders>
               <w:top w:val="single" w:sz="4" w:space="0" w:color="334155"/>
               <w:bottom w:val="single" w:sz="4" w:space="0" w:color="334155"/>
@@ -878,7 +995,7 @@
         </w:tc>
         <w:tc>
           <w:tcPr>
-            <w:tcW w:type="dxa" w:w="2628"/>
+            <w:tcW w:type="dxa" w:w="2160"/>
             <w:tcBorders>
               <w:top w:val="single" w:sz="4" w:space="0" w:color="334155"/>
               <w:bottom w:val="single" w:sz="4" w:space="0" w:color="334155"/>
@@ -897,7 +1014,7 @@
         </w:tc>
         <w:tc>
           <w:tcPr>
-            <w:tcW w:type="dxa" w:w="2628"/>
+            <w:tcW w:type="dxa" w:w="2160"/>
             <w:tcBorders>
               <w:top w:val="single" w:sz="4" w:space="0" w:color="334155"/>
               <w:bottom w:val="single" w:sz="4" w:space="0" w:color="334155"/>
@@ -916,7 +1033,7 @@
         </w:tc>
         <w:tc>
           <w:tcPr>
-            <w:tcW w:type="dxa" w:w="2628"/>
+            <w:tcW w:type="dxa" w:w="2160"/>
             <w:tcBorders>
               <w:top w:val="single" w:sz="4" w:space="0" w:color="334155"/>
               <w:bottom w:val="single" w:sz="4" w:space="0" w:color="334155"/>
@@ -936,6 +1053,25 @@
             </w:r>
           </w:p>
         </w:tc>
+        <w:tc>
+          <w:tcPr>
+            <w:tcW w:type="dxa" w:w="2160"/>
+            <w:tcBorders>
+              <w:top w:val="single" w:sz="4" w:space="0" w:color="334155"/>
+              <w:bottom w:val="single" w:sz="4" w:space="0" w:color="334155"/>
+              <w:left w:val="single" w:sz="4" w:space="0" w:color="334155"/>
+              <w:right w:val="single" w:sz="4" w:space="0" w:color="334155"/>
+            </w:tcBorders>
+          </w:tcPr>
+          <w:p>
+            <w:pPr>
+              <w:jc w:val="center"/>
+            </w:pPr>
+            <w:r>
+              <w:t>&lt;&lt;PI_TP&gt;&gt;</w:t>
+            </w:r>
+          </w:p>
+        </w:tc>
       </w:tr>
     </w:tbl>
     <w:p>
@@ -950,14 +1086,15 @@
         <w:tblLook w:firstColumn="1" w:firstRow="1" w:lastColumn="0" w:lastRow="0" w:noHBand="0" w:noVBand="1" w:val="04A0"/>
       </w:tblPr>
       <w:tblGrid>
-        <w:gridCol w:w="3504"/>
-        <w:gridCol w:w="3504"/>
-        <w:gridCol w:w="3504"/>
+        <w:gridCol w:w="2700"/>
+        <w:gridCol w:w="2700"/>
+        <w:gridCol w:w="2700"/>
+        <w:gridCol w:w="2700"/>
       </w:tblGrid>
       <w:tr>
         <w:tc>
           <w:tcPr>
-            <w:tcW w:type="dxa" w:w="3456"/>
+            <w:tcW w:type="dxa" w:w="2664"/>
             <w:shd w:val="clear" w:color="auto" w:fill="F8FAFC"/>
             <w:tcBorders>
               <w:top w:val="single" w:sz="4" w:space="0" w:color="CBD5E1"/>
@@ -979,7 +1116,7 @@
             </w:r>
             <w:r>
               <w:rPr>
-                <w:sz w:val="22"/>
+                <w:sz w:val="21"/>
               </w:rPr>
               <w:t>&lt;&lt;TOTAL&gt;&gt;</w:t>
             </w:r>
@@ -987,7 +1124,7 @@
         </w:tc>
         <w:tc>
           <w:tcPr>
-            <w:tcW w:type="dxa" w:w="3456"/>
+            <w:tcW w:type="dxa" w:w="2664"/>
             <w:shd w:val="clear" w:color="auto" w:fill="F8FAFC"/>
             <w:tcBorders>
               <w:top w:val="single" w:sz="4" w:space="0" w:color="CBD5E1"/>
@@ -1004,12 +1141,12 @@
               <w:rPr>
                 <w:b/>
               </w:rPr>
-              <w:t>PURATA KESELURUHAN</w:t>
+              <w:t>PURATA</w:t>
               <w:br/>
             </w:r>
             <w:r>
               <w:rPr>
-                <w:sz w:val="22"/>
+                <w:sz w:val="21"/>
               </w:rPr>
               <w:t>&lt;&lt;PURATA&gt;&gt;</w:t>
             </w:r>
@@ -1017,7 +1154,7 @@
         </w:tc>
         <w:tc>
           <w:tcPr>
-            <w:tcW w:type="dxa" w:w="3456"/>
+            <w:tcW w:type="dxa" w:w="2664"/>
             <w:shd w:val="clear" w:color="auto" w:fill="F8FAFC"/>
             <w:tcBorders>
               <w:top w:val="single" w:sz="4" w:space="0" w:color="CBD5E1"/>
@@ -1034,14 +1171,44 @@
               <w:rPr>
                 <w:b/>
               </w:rPr>
-              <w:t>KEDUDUKAN DALAM KELAS</w:t>
+              <w:t>KEDUDUKAN KELAS</w:t>
               <w:br/>
             </w:r>
             <w:r>
               <w:rPr>
-                <w:sz w:val="22"/>
+                <w:sz w:val="21"/>
               </w:rPr>
               <w:t>&lt;&lt;POSISI&gt;&gt;</w:t>
+            </w:r>
+          </w:p>
+        </w:tc>
+        <w:tc>
+          <w:tcPr>
+            <w:tcW w:type="dxa" w:w="2664"/>
+            <w:shd w:val="clear" w:color="auto" w:fill="F8FAFC"/>
+            <w:tcBorders>
+              <w:top w:val="single" w:sz="4" w:space="0" w:color="CBD5E1"/>
+              <w:bottom w:val="single" w:sz="4" w:space="0" w:color="CBD5E1"/>
+              <w:left w:val="single" w:sz="4" w:space="0" w:color="CBD5E1"/>
+              <w:right w:val="single" w:sz="4" w:space="0" w:color="CBD5E1"/>
+            </w:tcBorders>
+          </w:tcPr>
+          <w:p>
+            <w:pPr>
+              <w:jc w:val="center"/>
+            </w:pPr>
+            <w:r>
+              <w:rPr>
+                <w:b/>
+              </w:rPr>
+              <w:t>KEHADIRAN</w:t>
+              <w:br/>
+            </w:r>
+            <w:r>
+              <w:rPr>
+                <w:sz w:val="21"/>
+              </w:rPr>
+              <w:t>&lt;&lt;HADIR&gt;&gt;</w:t>
             </w:r>
           </w:p>
         </w:tc>
@@ -1062,7 +1229,7 @@
           <w:color w:val="64748B"/>
           <w:sz w:val="15"/>
         </w:rPr>
-        <w:t>Skala Gred SK Ranggu: A: 80-100 (Cemerlang) • B: 65-79 (Baik) • C: 50-64 (Memuaskan) • D: 40-49 (Tahap Minimum) • E: 0-39 (Belum Capai)</w:t>
+        <w:t>Skala Gred: A: 80-100 (Cemerlang) • B: 65-79 (Baik) • C: 50-64 (Memuaskan) • D: 40-49 (Tahap Minimum) • E: 0-39 (Belum Capai)</w:t>
       </w:r>
     </w:p>
     <w:tbl>
@@ -1072,12 +1239,12 @@
         <w:tblLook w:firstColumn="1" w:firstRow="1" w:lastColumn="0" w:lastRow="0" w:noHBand="0" w:noVBand="1" w:val="04A0"/>
       </w:tblPr>
       <w:tblGrid>
-        <w:gridCol w:w="10512"/>
+        <w:gridCol w:w="10800"/>
       </w:tblGrid>
       <w:tr>
         <w:tc>
           <w:tcPr>
-            <w:tcW w:type="dxa" w:w="10368"/>
+            <w:tcW w:type="dxa" w:w="10656"/>
             <w:shd w:val="clear" w:color="auto" w:fill="FAFAFA"/>
             <w:tcBorders>
               <w:top w:val="single" w:sz="4" w:space="0" w:color="CBD5E1"/>
@@ -1106,7 +1273,7 @@
     </w:tbl>
     <w:p>
       <w:pPr>
-        <w:spacing w:after="200"/>
+        <w:spacing w:after="160"/>
       </w:pPr>
     </w:p>
     <w:tbl>
@@ -1116,14 +1283,14 @@
         <w:tblLook w:firstColumn="1" w:firstRow="1" w:lastColumn="0" w:lastRow="0" w:noHBand="0" w:noVBand="1" w:val="04A0"/>
       </w:tblPr>
       <w:tblGrid>
-        <w:gridCol w:w="3504"/>
-        <w:gridCol w:w="3504"/>
-        <w:gridCol w:w="3504"/>
+        <w:gridCol w:w="3600"/>
+        <w:gridCol w:w="3600"/>
+        <w:gridCol w:w="3600"/>
       </w:tblGrid>
       <w:tr>
         <w:tc>
           <w:tcPr>
-            <w:tcW w:type="dxa" w:w="3456"/>
+            <w:tcW w:type="dxa" w:w="3528"/>
           </w:tcPr>
           <w:p>
             <w:r>
@@ -1133,7 +1300,7 @@
         </w:tc>
         <w:tc>
           <w:tcPr>
-            <w:tcW w:type="dxa" w:w="3456"/>
+            <w:tcW w:type="dxa" w:w="3528"/>
           </w:tcPr>
           <w:p>
             <w:r>
@@ -1143,7 +1310,7 @@
         </w:tc>
         <w:tc>
           <w:tcPr>
-            <w:tcW w:type="dxa" w:w="3456"/>
+            <w:tcW w:type="dxa" w:w="3600"/>
           </w:tcPr>
           <w:p>
             <w:r>
@@ -1155,7 +1322,7 @@
       <w:tr>
         <w:tc>
           <w:tcPr>
-            <w:tcW w:type="dxa" w:w="3456"/>
+            <w:tcW w:type="dxa" w:w="3528"/>
           </w:tcPr>
           <w:p>
             <w:r>
@@ -1172,7 +1339,7 @@
         </w:tc>
         <w:tc>
           <w:tcPr>
-            <w:tcW w:type="dxa" w:w="3456"/>
+            <w:tcW w:type="dxa" w:w="3528"/>
           </w:tcPr>
           <w:p>
             <w:r>
@@ -1191,7 +1358,7 @@
         </w:tc>
         <w:tc>
           <w:tcPr>
-            <w:tcW w:type="dxa" w:w="3456"/>
+            <w:tcW w:type="dxa" w:w="3600"/>
           </w:tcPr>
           <w:p>
             <w:r>
@@ -1210,7 +1377,7 @@
     </w:tbl>
     <w:sectPr>
       <w:pgSz w:w="12240" w:h="15840"/>
-      <w:pgMar w:top="720" w:right="864" w:bottom="720" w:left="864" w:header="720" w:footer="720" w:gutter="0"/>
+      <w:pgMar w:top="576" w:right="720" w:bottom="576" w:left="720" w:header="720" w:footer="720" w:gutter="0"/>
       <w:cols w:space="720"/>
       <w:docGrid w:linePitch="360"/>
     </w:sectPr>

</xml_diff>